<commit_message>
docs: ampliar notas de T&C con modelo de suscripción y puntos clave.
Co-authored-by: Cursor <cursoragent@cursor.com>
</commit_message>
<xml_diff>
--- a/T&C.docx
+++ b/T&C.docx
@@ -424,16 +424,7 @@
           <w:lang w:val="es-BO"/>
         </w:rPr>
         <w:lastRenderedPageBreak/>
-        <w:t>2</w:t>
-      </w:r>
-      <w:r>
-        <w:rPr>
-          <w:b/>
-          <w:bCs/>
-          <w:color w:val="EE0000"/>
-          <w:lang w:val="es-BO"/>
-        </w:rPr>
-        <w:t>. El Único Escenario de Riesgo Real (Y Cómo Evitarlo)</w:t>
+        <w:t>2. El Único Escenario de Riesgo Real (Y Cómo Evitarlo)</w:t>
       </w:r>
     </w:p>
     <w:p>
@@ -716,27 +707,84 @@
           <w:lang w:val="es-BO"/>
         </w:rPr>
       </w:pPr>
-    </w:p>
-    <w:p>
-      <w:pPr>
-        <w:rPr>
-          <w:lang w:val="es-BO"/>
-        </w:rPr>
-      </w:pPr>
-    </w:p>
-    <w:p>
-      <w:pPr>
-        <w:rPr>
-          <w:lang w:val="es-BO"/>
-        </w:rPr>
-      </w:pPr>
-    </w:p>
-    <w:p>
-      <w:pPr>
-        <w:rPr>
-          <w:lang w:val="es-BO"/>
-        </w:rPr>
-      </w:pPr>
+      <w:r>
+        <w:rPr>
+          <w:lang w:val="es-BO"/>
+        </w:rPr>
+        <w:t>"</w:t>
+      </w:r>
+      <w:r>
+        <w:rPr>
+          <w:lang w:val="es-BO"/>
+        </w:rPr>
+        <w:t xml:space="preserve">Se analizó </w:t>
+      </w:r>
+      <w:r>
+        <w:rPr>
+          <w:lang w:val="es-BO"/>
+        </w:rPr>
+        <w:t>los Términos y Condiciones de seca, así como su cartera de patentes públicas. </w:t>
+      </w:r>
+      <w:r>
+        <w:rPr>
+          <w:b/>
+          <w:bCs/>
+          <w:lang w:val="es-BO"/>
+        </w:rPr>
+        <w:t>El</w:t>
+      </w:r>
+      <w:r>
+        <w:rPr>
+          <w:b/>
+          <w:bCs/>
+          <w:lang w:val="es-BO"/>
+        </w:rPr>
+        <w:t xml:space="preserve"> sistema </w:t>
+      </w:r>
+      <w:proofErr w:type="spellStart"/>
+      <w:r>
+        <w:rPr>
+          <w:b/>
+          <w:bCs/>
+          <w:lang w:val="es-BO"/>
+        </w:rPr>
+        <w:t>VitaMetrix</w:t>
+      </w:r>
+      <w:proofErr w:type="spellEnd"/>
+      <w:r>
+        <w:rPr>
+          <w:b/>
+          <w:bCs/>
+          <w:lang w:val="es-BO"/>
+        </w:rPr>
+        <w:t xml:space="preserve"> no infringe los derechos de autor de seca</w:t>
+      </w:r>
+      <w:r>
+        <w:rPr>
+          <w:lang w:val="es-BO"/>
+        </w:rPr>
+        <w:t>, ya que no utilizamos su código ni su software. Los conceptos médicos que maneja</w:t>
+      </w:r>
+      <w:r>
+        <w:rPr>
+          <w:lang w:val="es-BO"/>
+        </w:rPr>
+        <w:t xml:space="preserve"> </w:t>
+      </w:r>
+      <w:proofErr w:type="spellStart"/>
+      <w:r>
+        <w:rPr>
+          <w:lang w:val="es-BO"/>
+        </w:rPr>
+        <w:t>VitaMetrix</w:t>
+      </w:r>
+      <w:proofErr w:type="spellEnd"/>
+      <w:r>
+        <w:rPr>
+          <w:lang w:val="es-BO"/>
+        </w:rPr>
+        <w:t xml:space="preserve"> (BIVA, composición corporal, etc.) son de dominio público y no son propiedad exclusiva de seca.</w:t>
+      </w:r>
     </w:p>
     <w:p>
       <w:pPr>
@@ -749,41 +797,39 @@
           <w:lang w:val="es-BO"/>
         </w:rPr>
         <w:lastRenderedPageBreak/>
-        <w:t>"</w:t>
-      </w:r>
-      <w:r>
-        <w:rPr>
-          <w:lang w:val="es-BO"/>
-        </w:rPr>
-        <w:t xml:space="preserve">Se analizó </w:t>
-      </w:r>
-      <w:r>
-        <w:rPr>
-          <w:lang w:val="es-BO"/>
-        </w:rPr>
-        <w:t>los Términos y Condiciones de seca, así como su cartera de patentes públicas. </w:t>
-      </w:r>
-      <w:r>
-        <w:rPr>
-          <w:b/>
-          <w:bCs/>
-          <w:lang w:val="es-BO"/>
-        </w:rPr>
-        <w:t>El</w:t>
-      </w:r>
-      <w:r>
-        <w:rPr>
-          <w:b/>
-          <w:bCs/>
-          <w:lang w:val="es-BO"/>
-        </w:rPr>
-        <w:t xml:space="preserve"> sistema </w:t>
+        <w:t>El único riesgo potencial, común en cualquier desarrollo de software en el sector médico, es el de </w:t>
+      </w:r>
+      <w:r>
+        <w:rPr>
+          <w:b/>
+          <w:bCs/>
+          <w:lang w:val="es-BO"/>
+        </w:rPr>
+        <w:t>patentes</w:t>
+      </w:r>
+      <w:r>
+        <w:rPr>
+          <w:lang w:val="es-BO"/>
+        </w:rPr>
+        <w:t>. Sin embargo, las patentes de seca protegen principalmente su </w:t>
+      </w:r>
+      <w:r>
+        <w:rPr>
+          <w:b/>
+          <w:bCs/>
+          <w:lang w:val="es-BO"/>
+        </w:rPr>
+        <w:t>hardware</w:t>
+      </w:r>
+      <w:r>
+        <w:rPr>
+          <w:lang w:val="es-BO"/>
+        </w:rPr>
+        <w:t xml:space="preserve"> y métodos de medición específicos, no el procesamiento de datos ni la visualización de resultados. </w:t>
       </w:r>
       <w:proofErr w:type="spellStart"/>
       <w:r>
         <w:rPr>
-          <w:b/>
-          <w:bCs/>
           <w:lang w:val="es-BO"/>
         </w:rPr>
         <w:t>VitaMetrix</w:t>
@@ -791,29 +837,550 @@
       <w:proofErr w:type="spellEnd"/>
       <w:r>
         <w:rPr>
-          <w:b/>
-          <w:bCs/>
-          <w:lang w:val="es-BO"/>
-        </w:rPr>
-        <w:t xml:space="preserve"> no infringe los derechos de autor de seca</w:t>
-      </w:r>
-      <w:r>
-        <w:rPr>
-          <w:lang w:val="es-BO"/>
-        </w:rPr>
-        <w:t>, ya que no utilizamos su código ni su software. Los conceptos médicos que maneja</w:t>
-      </w:r>
-      <w:r>
-        <w:rPr>
           <w:lang w:val="es-BO"/>
         </w:rPr>
         <w:t xml:space="preserve"> </w:t>
       </w:r>
+      <w:r>
+        <w:rPr>
+          <w:lang w:val="es-BO"/>
+        </w:rPr>
+        <w:t xml:space="preserve">está desarrollado </w:t>
+      </w:r>
+      <w:r>
+        <w:rPr>
+          <w:lang w:val="es-BO"/>
+        </w:rPr>
+        <w:t>con una arquitectura y una interfaz de usuario originales, lo que minimiza cualquier riesgo.</w:t>
+      </w:r>
+    </w:p>
+    <w:p>
+      <w:pPr>
+        <w:rPr>
+          <w:lang w:val="es-BO"/>
+        </w:rPr>
+      </w:pPr>
+      <w:r>
+        <w:rPr>
+          <w:lang w:val="es-BO"/>
+        </w:rPr>
+        <w:t xml:space="preserve">Para garantizar una protección total, </w:t>
+      </w:r>
+      <w:r>
+        <w:rPr>
+          <w:lang w:val="es-BO"/>
+        </w:rPr>
+        <w:t>es recomendable</w:t>
+      </w:r>
+      <w:r>
+        <w:rPr>
+          <w:lang w:val="es-BO"/>
+        </w:rPr>
+        <w:t xml:space="preserve"> documentar todo el proceso de desarrollo y, si el proyecto crece, realizar una búsqueda de patentes específica con un asesor legal."</w:t>
+      </w:r>
+    </w:p>
+    <w:p>
+      <w:pPr>
+        <w:rPr>
+          <w:lang w:val="es-BO"/>
+        </w:rPr>
+      </w:pPr>
+    </w:p>
+    <w:p>
+      <w:pPr>
+        <w:rPr>
+          <w:lang w:val="es-BO"/>
+        </w:rPr>
+      </w:pPr>
+    </w:p>
+    <w:p>
+      <w:pPr>
+        <w:rPr>
+          <w:lang w:val="es-BO"/>
+        </w:rPr>
+      </w:pPr>
+    </w:p>
+    <w:p>
+      <w:pPr>
+        <w:ind w:left="360"/>
+        <w:jc w:val="center"/>
+        <w:rPr>
+          <w:rFonts w:ascii="Arial Rounded MT Bold" w:hAnsi="Arial Rounded MT Bold"/>
+          <w:color w:val="EE0000"/>
+          <w:u w:val="single"/>
+          <w:lang w:val="es-BO"/>
+        </w:rPr>
+      </w:pPr>
+      <w:r>
+        <w:rPr>
+          <w:rFonts w:ascii="Arial Rounded MT Bold" w:hAnsi="Arial Rounded MT Bold"/>
+          <w:color w:val="EE0000"/>
+          <w:u w:val="single"/>
+          <w:lang w:val="es-BO"/>
+        </w:rPr>
+        <w:t>PUNTOS CLAVE</w:t>
+      </w:r>
+    </w:p>
+    <w:p>
+      <w:pPr>
+        <w:pStyle w:val="Prrafodelista"/>
+        <w:numPr>
+          <w:ilvl w:val="0"/>
+          <w:numId w:val="5"/>
+        </w:numPr>
+        <w:rPr>
+          <w:lang w:val="es-BO"/>
+        </w:rPr>
+      </w:pPr>
+      <w:r>
+        <w:rPr>
+          <w:lang w:val="es-BO"/>
+        </w:rPr>
+        <w:t>¿Es un sistema para UNA persona o cuál es su plan frente a la cantidad de personas que tendrán acceso al sistema?</w:t>
+      </w:r>
+    </w:p>
+    <w:p>
+      <w:pPr>
+        <w:pStyle w:val="Prrafodelista"/>
+        <w:numPr>
+          <w:ilvl w:val="0"/>
+          <w:numId w:val="5"/>
+        </w:numPr>
+        <w:rPr>
+          <w:lang w:val="es-BO"/>
+        </w:rPr>
+      </w:pPr>
+      <w:r>
+        <w:rPr>
+          <w:lang w:val="es-BO"/>
+        </w:rPr>
+        <w:t>¿Cómo funciona el servicio que brindan actualmente?</w:t>
+      </w:r>
+    </w:p>
+    <w:p>
+      <w:pPr>
+        <w:pStyle w:val="Prrafodelista"/>
+        <w:numPr>
+          <w:ilvl w:val="0"/>
+          <w:numId w:val="5"/>
+        </w:numPr>
+        <w:rPr>
+          <w:lang w:val="es-BO"/>
+        </w:rPr>
+      </w:pPr>
+      <w:r>
+        <w:rPr>
+          <w:lang w:val="es-BO"/>
+        </w:rPr>
+        <w:t>¿Qué capacidades tienen y qué áreas de mejora les gustaría implementar?</w:t>
+      </w:r>
+    </w:p>
+    <w:p>
+      <w:pPr>
+        <w:pStyle w:val="Prrafodelista"/>
+        <w:numPr>
+          <w:ilvl w:val="0"/>
+          <w:numId w:val="5"/>
+        </w:numPr>
+        <w:rPr>
+          <w:lang w:val="es-BO"/>
+        </w:rPr>
+      </w:pPr>
+      <w:r>
+        <w:rPr>
+          <w:lang w:val="es-BO"/>
+        </w:rPr>
+        <w:t>Si desean “</w:t>
+      </w:r>
       <w:proofErr w:type="spellStart"/>
       <w:r>
         <w:rPr>
           <w:lang w:val="es-BO"/>
         </w:rPr>
+        <w:t>Suscripcion</w:t>
+      </w:r>
+      <w:proofErr w:type="spellEnd"/>
+      <w:r>
+        <w:rPr>
+          <w:lang w:val="es-BO"/>
+        </w:rPr>
+        <w:t>” pueden pausar/cancelar su suscripción y se congelan los accesos hasta volver a activar una suscripción.</w:t>
+      </w:r>
+    </w:p>
+    <w:p>
+      <w:pPr>
+        <w:pStyle w:val="Prrafodelista"/>
+        <w:numPr>
+          <w:ilvl w:val="0"/>
+          <w:numId w:val="5"/>
+        </w:numPr>
+        <w:rPr>
+          <w:lang w:val="es-BO"/>
+        </w:rPr>
+      </w:pPr>
+    </w:p>
+    <w:p>
+      <w:pPr>
+        <w:ind w:left="360"/>
+        <w:rPr>
+          <w:lang w:val="es-BO"/>
+        </w:rPr>
+      </w:pPr>
+    </w:p>
+    <w:p>
+      <w:pPr>
+        <w:ind w:left="360"/>
+        <w:rPr>
+          <w:lang w:val="es-BO"/>
+        </w:rPr>
+      </w:pPr>
+    </w:p>
+    <w:p>
+      <w:pPr>
+        <w:ind w:left="360"/>
+        <w:jc w:val="center"/>
+        <w:rPr>
+          <w:b/>
+          <w:bCs/>
+          <w:i/>
+          <w:iCs/>
+          <w:u w:val="single"/>
+          <w:lang w:val="es-BO"/>
+        </w:rPr>
+      </w:pPr>
+      <w:r>
+        <w:rPr>
+          <w:b/>
+          <w:bCs/>
+          <w:i/>
+          <w:iCs/>
+          <w:color w:val="EE0000"/>
+          <w:sz w:val="32"/>
+          <w:szCs w:val="32"/>
+          <w:u w:val="single"/>
+          <w:lang w:val="es-BO"/>
+        </w:rPr>
+        <w:t>Visión Estratégica</w:t>
+      </w:r>
+    </w:p>
+    <w:p>
+      <w:pPr>
+        <w:ind w:left="360"/>
+        <w:rPr>
+          <w:b/>
+          <w:bCs/>
+          <w:lang w:val="es-BO"/>
+        </w:rPr>
+      </w:pPr>
+      <w:r>
+        <w:rPr>
+          <w:b/>
+          <w:bCs/>
+          <w:lang w:val="es-BO"/>
+        </w:rPr>
+        <w:t>1. Postura principal: Suscripción por Usuario</w:t>
+      </w:r>
+    </w:p>
+    <w:p>
+      <w:pPr>
+        <w:ind w:left="360"/>
+      </w:pPr>
+      <w:r>
+        <w:rPr>
+          <w:b/>
+          <w:bCs/>
+        </w:rPr>
+        <w:t xml:space="preserve">¿Por </w:t>
+      </w:r>
+      <w:proofErr w:type="spellStart"/>
+      <w:r>
+        <w:rPr>
+          <w:b/>
+          <w:bCs/>
+        </w:rPr>
+        <w:t>qué</w:t>
+      </w:r>
+      <w:proofErr w:type="spellEnd"/>
+      <w:r>
+        <w:rPr>
+          <w:b/>
+          <w:bCs/>
+        </w:rPr>
+        <w:t>?</w:t>
+      </w:r>
+    </w:p>
+    <w:p>
+      <w:pPr>
+        <w:numPr>
+          <w:ilvl w:val="0"/>
+          <w:numId w:val="6"/>
+        </w:numPr>
+        <w:rPr>
+          <w:lang w:val="es-BO"/>
+        </w:rPr>
+      </w:pPr>
+      <w:r>
+        <w:rPr>
+          <w:lang w:val="es-BO"/>
+        </w:rPr>
+        <w:t>Aunque </w:t>
+      </w:r>
+      <w:r>
+        <w:rPr>
+          <w:b/>
+          <w:bCs/>
+          <w:lang w:val="es-BO"/>
+        </w:rPr>
+        <w:t>hoy</w:t>
+      </w:r>
+      <w:r>
+        <w:rPr>
+          <w:lang w:val="es-BO"/>
+        </w:rPr>
+        <w:t> solo lo use 1 persona, en una clínica o consultorio médico, </w:t>
+      </w:r>
+      <w:r>
+        <w:rPr>
+          <w:b/>
+          <w:bCs/>
+          <w:lang w:val="es-BO"/>
+        </w:rPr>
+        <w:t>siempre aparece un segundo usuario</w:t>
+      </w:r>
+      <w:r>
+        <w:rPr>
+          <w:lang w:val="es-BO"/>
+        </w:rPr>
+        <w:t>: la recepcionista que registra pacientes, el nutricionista que ve los reportes, o el médico deportólogo que da seguimiento.</w:t>
+      </w:r>
+    </w:p>
+    <w:p>
+      <w:pPr>
+        <w:numPr>
+          <w:ilvl w:val="0"/>
+          <w:numId w:val="6"/>
+        </w:numPr>
+        <w:rPr>
+          <w:lang w:val="es-BO"/>
+        </w:rPr>
+      </w:pPr>
+      <w:r>
+        <w:rPr>
+          <w:lang w:val="es-BO"/>
+        </w:rPr>
+        <w:t>Si vendes un pago único "para 1 usuario", cuando quieran agregar al asistente, no sabrás si cobrarles otro pago completo o un descuento. Con la suscripción, simplemente añades un asiento adicional en el panel de administración y cobras proporcionalmente.</w:t>
+      </w:r>
+    </w:p>
+    <w:p>
+      <w:pPr>
+        <w:ind w:left="720"/>
+        <w:rPr>
+          <w:lang w:val="es-BO"/>
+        </w:rPr>
+      </w:pPr>
+    </w:p>
+    <w:p>
+      <w:pPr>
+        <w:ind w:left="720"/>
+        <w:rPr>
+          <w:lang w:val="es-BO"/>
+        </w:rPr>
+      </w:pPr>
+    </w:p>
+    <w:p>
+      <w:pPr>
+        <w:pStyle w:val="Prrafodelista"/>
+        <w:numPr>
+          <w:ilvl w:val="1"/>
+          <w:numId w:val="6"/>
+        </w:numPr>
+        <w:rPr>
+          <w:lang w:val="es-BO"/>
+        </w:rPr>
+      </w:pPr>
+      <w:r>
+        <w:rPr>
+          <w:b/>
+          <w:bCs/>
+          <w:lang w:val="es-BO"/>
+        </w:rPr>
+        <w:t>Plan de Suscripción:</w:t>
+      </w:r>
+    </w:p>
+    <w:p>
+      <w:pPr>
+        <w:numPr>
+          <w:ilvl w:val="0"/>
+          <w:numId w:val="7"/>
+        </w:numPr>
+        <w:rPr>
+          <w:lang w:val="es-BO"/>
+        </w:rPr>
+      </w:pPr>
+      <w:r>
+        <w:rPr>
+          <w:b/>
+          <w:bCs/>
+          <w:lang w:val="es-BO"/>
+        </w:rPr>
+        <w:t>Plan Individual (1 Usuario):</w:t>
+      </w:r>
+      <w:r>
+        <w:rPr>
+          <w:lang w:val="es-BO"/>
+        </w:rPr>
+        <w:t> 120 Bs / mes (o 288 Bs/</w:t>
+      </w:r>
+      <w:proofErr w:type="spellStart"/>
+      <w:r>
+        <w:rPr>
+          <w:lang w:val="es-BO"/>
+        </w:rPr>
+        <w:t>trim</w:t>
+      </w:r>
+      <w:proofErr w:type="spellEnd"/>
+      <w:r>
+        <w:rPr>
+          <w:lang w:val="es-BO"/>
+        </w:rPr>
+        <w:t>, 504 Bs/</w:t>
+      </w:r>
+      <w:proofErr w:type="spellStart"/>
+      <w:r>
+        <w:rPr>
+          <w:lang w:val="es-BO"/>
+        </w:rPr>
+        <w:t>sem</w:t>
+      </w:r>
+      <w:proofErr w:type="spellEnd"/>
+      <w:r>
+        <w:rPr>
+          <w:lang w:val="es-BO"/>
+        </w:rPr>
+        <w:t>).</w:t>
+      </w:r>
+    </w:p>
+    <w:p>
+      <w:pPr>
+        <w:numPr>
+          <w:ilvl w:val="0"/>
+          <w:numId w:val="7"/>
+        </w:numPr>
+        <w:rPr>
+          <w:lang w:val="es-BO"/>
+        </w:rPr>
+      </w:pPr>
+      <w:r>
+        <w:rPr>
+          <w:b/>
+          <w:bCs/>
+          <w:lang w:val="es-BO"/>
+        </w:rPr>
+        <w:t>Plan Profesional (hasta 3 Usuarios):</w:t>
+      </w:r>
+      <w:r>
+        <w:rPr>
+          <w:lang w:val="es-BO"/>
+        </w:rPr>
+        <w:t xml:space="preserve"> 280 Bs / mes (incluye roles: </w:t>
+      </w:r>
+      <w:proofErr w:type="spellStart"/>
+      <w:r>
+        <w:rPr>
+          <w:lang w:val="es-BO"/>
+        </w:rPr>
+        <w:t>Admin</w:t>
+      </w:r>
+      <w:proofErr w:type="spellEnd"/>
+      <w:r>
+        <w:rPr>
+          <w:lang w:val="es-BO"/>
+        </w:rPr>
+        <w:t>, Médico, Recepcionista).</w:t>
+      </w:r>
+    </w:p>
+    <w:p>
+      <w:pPr>
+        <w:numPr>
+          <w:ilvl w:val="0"/>
+          <w:numId w:val="7"/>
+        </w:numPr>
+        <w:rPr>
+          <w:lang w:val="es-BO"/>
+        </w:rPr>
+      </w:pPr>
+      <w:r>
+        <w:rPr>
+          <w:b/>
+          <w:bCs/>
+          <w:lang w:val="es-BO"/>
+        </w:rPr>
+        <w:t>Plan Clínica (hasta 10 Usuarios):</w:t>
+      </w:r>
+      <w:r>
+        <w:rPr>
+          <w:lang w:val="es-BO"/>
+        </w:rPr>
+        <w:t> 600 Bs / mes (ideal para centros de rehabilitación o gimnasios).</w:t>
+      </w:r>
+    </w:p>
+    <w:p>
+      <w:pPr>
+        <w:ind w:left="360"/>
+        <w:rPr>
+          <w:lang w:val="es-BO"/>
+        </w:rPr>
+      </w:pPr>
+    </w:p>
+    <w:p>
+      <w:pPr>
+        <w:pStyle w:val="Prrafodelista"/>
+        <w:numPr>
+          <w:ilvl w:val="1"/>
+          <w:numId w:val="6"/>
+        </w:numPr>
+        <w:rPr>
+          <w:lang w:val="es-BO"/>
+        </w:rPr>
+      </w:pPr>
+      <w:r>
+        <w:rPr>
+          <w:b/>
+          <w:bCs/>
+          <w:lang w:val="es-BO"/>
+        </w:rPr>
+        <w:t>Programa de Referidos (Marketing de bajo costo):</w:t>
+      </w:r>
+    </w:p>
+    <w:p>
+      <w:pPr>
+        <w:numPr>
+          <w:ilvl w:val="1"/>
+          <w:numId w:val="8"/>
+        </w:numPr>
+        <w:rPr>
+          <w:lang w:val="es-BO"/>
+        </w:rPr>
+      </w:pPr>
+      <w:r>
+        <w:rPr>
+          <w:b/>
+          <w:bCs/>
+          <w:lang w:val="es-BO"/>
+        </w:rPr>
+        <w:t>Al referente (Cliente A):</w:t>
+      </w:r>
+      <w:r>
+        <w:rPr>
+          <w:lang w:val="es-BO"/>
+        </w:rPr>
+        <w:t xml:space="preserve"> "Por cada colega que contrate </w:t>
+      </w:r>
+      <w:proofErr w:type="spellStart"/>
+      <w:r>
+        <w:rPr>
+          <w:lang w:val="es-BO"/>
+        </w:rPr>
         <w:t>VitaMetrix</w:t>
       </w:r>
       <w:proofErr w:type="spellEnd"/>
@@ -821,103 +1388,37 @@
         <w:rPr>
           <w:lang w:val="es-BO"/>
         </w:rPr>
-        <w:t xml:space="preserve"> (BIVA, composición corporal, etc.) son de dominio público y no son propiedad exclusiva de seca.</w:t>
-      </w:r>
-    </w:p>
-    <w:p>
-      <w:pPr>
-        <w:rPr>
-          <w:lang w:val="es-BO"/>
-        </w:rPr>
-      </w:pPr>
-      <w:r>
-        <w:rPr>
-          <w:lang w:val="es-BO"/>
-        </w:rPr>
-        <w:t>El único riesgo potencial, común en cualquier desarrollo de software en el sector médico, es el de </w:t>
-      </w:r>
-      <w:r>
-        <w:rPr>
-          <w:b/>
-          <w:bCs/>
-          <w:lang w:val="es-BO"/>
-        </w:rPr>
-        <w:t>patentes</w:t>
-      </w:r>
-      <w:r>
-        <w:rPr>
-          <w:lang w:val="es-BO"/>
-        </w:rPr>
-        <w:t>. Sin embargo, las patentes de seca protegen principalmente su </w:t>
-      </w:r>
-      <w:r>
-        <w:rPr>
-          <w:b/>
-          <w:bCs/>
-          <w:lang w:val="es-BO"/>
-        </w:rPr>
-        <w:t>hardware</w:t>
-      </w:r>
-      <w:r>
-        <w:rPr>
-          <w:lang w:val="es-BO"/>
-        </w:rPr>
-        <w:t xml:space="preserve"> y métodos de medición específicos, no el procesamiento de datos ni la visualización de resultados. </w:t>
-      </w:r>
-      <w:proofErr w:type="spellStart"/>
-      <w:r>
-        <w:rPr>
-          <w:lang w:val="es-BO"/>
-        </w:rPr>
-        <w:t>VitaMetrix</w:t>
-      </w:r>
-      <w:proofErr w:type="spellEnd"/>
-      <w:r>
-        <w:rPr>
-          <w:lang w:val="es-BO"/>
-        </w:rPr>
-        <w:t xml:space="preserve"> </w:t>
-      </w:r>
-      <w:r>
-        <w:rPr>
-          <w:lang w:val="es-BO"/>
-        </w:rPr>
-        <w:t xml:space="preserve">está desarrollado </w:t>
-      </w:r>
-      <w:r>
-        <w:rPr>
-          <w:lang w:val="es-BO"/>
-        </w:rPr>
-        <w:t>con una arquitectura y una interfaz de usuario originales, lo que minimiza cualquier riesgo.</w:t>
-      </w:r>
-    </w:p>
-    <w:p>
-      <w:pPr>
-        <w:rPr>
-          <w:lang w:val="es-BO"/>
-        </w:rPr>
-      </w:pPr>
-      <w:r>
-        <w:rPr>
-          <w:lang w:val="es-BO"/>
-        </w:rPr>
-        <w:t xml:space="preserve">Para garantizar una protección total, </w:t>
-      </w:r>
-      <w:r>
-        <w:rPr>
-          <w:lang w:val="es-BO"/>
-        </w:rPr>
-        <w:t>es recomendable</w:t>
-      </w:r>
-      <w:r>
-        <w:rPr>
-          <w:lang w:val="es-BO"/>
-        </w:rPr>
-        <w:t xml:space="preserve"> documentar todo el proceso de desarrollo y, si el proyecto crece, realizar una búsqueda de patentes específica con un asesor legal."</w:t>
-      </w:r>
-    </w:p>
-    <w:p>
-      <w:pPr>
+        <w:t>, te regalamos 1 mes de servicio gratis acumulable (hasta 6 meses al año)."</w:t>
+      </w:r>
+    </w:p>
+    <w:p>
+      <w:pPr>
+        <w:numPr>
+          <w:ilvl w:val="1"/>
+          <w:numId w:val="8"/>
+        </w:numPr>
+        <w:rPr>
+          <w:lang w:val="es-BO"/>
+        </w:rPr>
+      </w:pPr>
+      <w:r>
+        <w:rPr>
+          <w:b/>
+          <w:bCs/>
+          <w:lang w:val="es-BO"/>
+        </w:rPr>
+        <w:t>Al referido (Cliente B):</w:t>
+      </w:r>
+      <w:r>
+        <w:rPr>
+          <w:lang w:val="es-BO"/>
+        </w:rPr>
+        <w:t> "Menciona el nombre de tu colega y obtén un 15% de descuento en tu primer trimestre."</w:t>
+      </w:r>
+    </w:p>
+    <w:p>
+      <w:pPr>
+        <w:ind w:left="360"/>
         <w:rPr>
           <w:lang w:val="es-BO"/>
         </w:rPr>
@@ -936,6 +1437,95 @@
 <file path=word/numbering.xml><?xml version="1.0" encoding="utf-8"?>
 <w:numbering xmlns:wpc="http://schemas.microsoft.com/office/word/2010/wordprocessingCanvas" xmlns:cx="http://schemas.microsoft.com/office/drawing/2014/chartex" xmlns:cx1="http://schemas.microsoft.com/office/drawing/2015/9/8/chartex" xmlns:cx2="http://schemas.microsoft.com/office/drawing/2015/10/21/chartex" xmlns:cx3="http://schemas.microsoft.com/office/drawing/2016/5/9/chartex" xmlns:cx4="http://schemas.microsoft.com/office/drawing/2016/5/10/chartex" xmlns:cx5="http://schemas.microsoft.com/office/drawing/2016/5/11/chartex" xmlns:cx6="http://schemas.microsoft.com/office/drawing/2016/5/12/chartex" xmlns:cx7="http://schemas.microsoft.com/office/drawing/2016/5/13/chartex" xmlns:cx8="http://schemas.microsoft.com/office/drawing/2016/5/14/chartex" xmlns:mc="http://schemas.openxmlformats.org/markup-compatibility/2006" xmlns:aink="http://schemas.microsoft.com/office/drawing/2016/ink" xmlns:am3d="http://schemas.microsoft.com/office/drawing/2017/model3d" xmlns:o="urn:schemas-microsoft-com:office:office" xmlns:oel="http://schemas.microsoft.com/office/2019/extlst" xmlns:r="http://schemas.openxmlformats.org/officeDocument/2006/relationships" xmlns:m="http://schemas.openxmlformats.org/officeDocument/2006/math" xmlns:v="urn:schemas-microsoft-com:vml" xmlns:wp14="http://schemas.microsoft.com/office/word/2010/wordprocessingDrawing" xmlns:wp="http://schemas.openxmlformats.org/drawingml/2006/wordprocessingDrawing" xmlns:w10="urn:schemas-microsoft-com:office:word" xmlns:w="http://schemas.openxmlformats.org/wordprocessingml/2006/main" xmlns:w14="http://schemas.microsoft.com/office/word/2010/wordml" xmlns:w15="http://schemas.microsoft.com/office/word/2012/wordml" xmlns:w16cei="http://schemas.microsoft.com/office/word/2026/wordml/cei" xmlns:w16cex="http://schemas.microsoft.com/office/word/2018/wordml/cex" xmlns:w16cid="http://schemas.microsoft.com/office/word/2016/wordml/cid" xmlns:w16="http://schemas.microsoft.com/office/word/2018/wordml" xmlns:w16du="http://schemas.microsoft.com/office/word/2023/wordml/word16du" xmlns:w16sdtdh="http://schemas.microsoft.com/office/word/2020/wordml/sdtdatahash" xmlns:w16sdtfl="http://schemas.microsoft.com/office/word/2024/wordml/sdtformatlock" xmlns:w16se="http://schemas.microsoft.com/office/word/2015/wordml/symex" xmlns:wpg="http://schemas.microsoft.com/office/word/2010/wordprocessingGroup" xmlns:wpi="http://schemas.microsoft.com/office/word/2010/wordprocessingInk" xmlns:wne="http://schemas.microsoft.com/office/word/2006/wordml" xmlns:wps="http://schemas.microsoft.com/office/word/2010/wordprocessingShape" mc:Ignorable="w14 w15 w16se w16cid w16 w16cex w16sdtdh w16sdtfl w16du wp14">
   <w:abstractNum w:abstractNumId="0" w15:restartNumberingAfterBreak="0">
+    <w:nsid w:val="01D02710"/>
+    <w:multiLevelType w:val="hybridMultilevel"/>
+    <w:tmpl w:val="BF44397E"/>
+    <w:lvl w:ilvl="0" w:tplc="04090011">
+      <w:start w:val="1"/>
+      <w:numFmt w:val="decimal"/>
+      <w:lvlText w:val="%1)"/>
+      <w:lvlJc w:val="left"/>
+      <w:pPr>
+        <w:ind w:left="720" w:hanging="360"/>
+      </w:pPr>
+      <w:rPr>
+        <w:rFonts w:hint="default"/>
+      </w:rPr>
+    </w:lvl>
+    <w:lvl w:ilvl="1" w:tplc="04090019" w:tentative="1">
+      <w:start w:val="1"/>
+      <w:numFmt w:val="lowerLetter"/>
+      <w:lvlText w:val="%2."/>
+      <w:lvlJc w:val="left"/>
+      <w:pPr>
+        <w:ind w:left="1440" w:hanging="360"/>
+      </w:pPr>
+    </w:lvl>
+    <w:lvl w:ilvl="2" w:tplc="0409001B" w:tentative="1">
+      <w:start w:val="1"/>
+      <w:numFmt w:val="lowerRoman"/>
+      <w:lvlText w:val="%3."/>
+      <w:lvlJc w:val="right"/>
+      <w:pPr>
+        <w:ind w:left="2160" w:hanging="180"/>
+      </w:pPr>
+    </w:lvl>
+    <w:lvl w:ilvl="3" w:tplc="0409000F" w:tentative="1">
+      <w:start w:val="1"/>
+      <w:numFmt w:val="decimal"/>
+      <w:lvlText w:val="%4."/>
+      <w:lvlJc w:val="left"/>
+      <w:pPr>
+        <w:ind w:left="2880" w:hanging="360"/>
+      </w:pPr>
+    </w:lvl>
+    <w:lvl w:ilvl="4" w:tplc="04090019" w:tentative="1">
+      <w:start w:val="1"/>
+      <w:numFmt w:val="lowerLetter"/>
+      <w:lvlText w:val="%5."/>
+      <w:lvlJc w:val="left"/>
+      <w:pPr>
+        <w:ind w:left="3600" w:hanging="360"/>
+      </w:pPr>
+    </w:lvl>
+    <w:lvl w:ilvl="5" w:tplc="0409001B" w:tentative="1">
+      <w:start w:val="1"/>
+      <w:numFmt w:val="lowerRoman"/>
+      <w:lvlText w:val="%6."/>
+      <w:lvlJc w:val="right"/>
+      <w:pPr>
+        <w:ind w:left="4320" w:hanging="180"/>
+      </w:pPr>
+    </w:lvl>
+    <w:lvl w:ilvl="6" w:tplc="0409000F" w:tentative="1">
+      <w:start w:val="1"/>
+      <w:numFmt w:val="decimal"/>
+      <w:lvlText w:val="%7."/>
+      <w:lvlJc w:val="left"/>
+      <w:pPr>
+        <w:ind w:left="5040" w:hanging="360"/>
+      </w:pPr>
+    </w:lvl>
+    <w:lvl w:ilvl="7" w:tplc="04090019" w:tentative="1">
+      <w:start w:val="1"/>
+      <w:numFmt w:val="lowerLetter"/>
+      <w:lvlText w:val="%8."/>
+      <w:lvlJc w:val="left"/>
+      <w:pPr>
+        <w:ind w:left="5760" w:hanging="360"/>
+      </w:pPr>
+    </w:lvl>
+    <w:lvl w:ilvl="8" w:tplc="0409001B" w:tentative="1">
+      <w:start w:val="1"/>
+      <w:numFmt w:val="lowerRoman"/>
+      <w:lvlText w:val="%9."/>
+      <w:lvlJc w:val="right"/>
+      <w:pPr>
+        <w:ind w:left="6480" w:hanging="180"/>
+      </w:pPr>
+    </w:lvl>
+  </w:abstractNum>
+  <w:abstractNum w:abstractNumId="1" w15:restartNumberingAfterBreak="0">
     <w:nsid w:val="022027CC"/>
     <w:multiLevelType w:val="multilevel"/>
     <w:tmpl w:val="02DAB95A"/>
@@ -1048,7 +1638,7 @@
       </w:pPr>
     </w:lvl>
   </w:abstractNum>
-  <w:abstractNum w:abstractNumId="1" w15:restartNumberingAfterBreak="0">
+  <w:abstractNum w:abstractNumId="2" w15:restartNumberingAfterBreak="0">
     <w:nsid w:val="07FB5F2E"/>
     <w:multiLevelType w:val="multilevel"/>
     <w:tmpl w:val="495A9332"/>
@@ -1197,7 +1787,419 @@
       </w:rPr>
     </w:lvl>
   </w:abstractNum>
-  <w:abstractNum w:abstractNumId="2" w15:restartNumberingAfterBreak="0">
+  <w:abstractNum w:abstractNumId="3" w15:restartNumberingAfterBreak="0">
+    <w:nsid w:val="0E8D75B5"/>
+    <w:multiLevelType w:val="multilevel"/>
+    <w:tmpl w:val="03448E80"/>
+    <w:lvl w:ilvl="0">
+      <w:start w:val="1"/>
+      <w:numFmt w:val="decimal"/>
+      <w:lvlText w:val="%1."/>
+      <w:lvlJc w:val="left"/>
+      <w:pPr>
+        <w:tabs>
+          <w:tab w:val="num" w:pos="720"/>
+        </w:tabs>
+        <w:ind w:left="720" w:hanging="360"/>
+      </w:pPr>
+    </w:lvl>
+    <w:lvl w:ilvl="1">
+      <w:start w:val="1"/>
+      <w:numFmt w:val="bullet"/>
+      <w:lvlText w:val="o"/>
+      <w:lvlJc w:val="left"/>
+      <w:pPr>
+        <w:tabs>
+          <w:tab w:val="num" w:pos="1440"/>
+        </w:tabs>
+        <w:ind w:left="1440" w:hanging="360"/>
+      </w:pPr>
+      <w:rPr>
+        <w:rFonts w:ascii="Courier New" w:hAnsi="Courier New" w:hint="default"/>
+        <w:sz w:val="20"/>
+      </w:rPr>
+    </w:lvl>
+    <w:lvl w:ilvl="2" w:tentative="1">
+      <w:start w:val="1"/>
+      <w:numFmt w:val="decimal"/>
+      <w:lvlText w:val="%3."/>
+      <w:lvlJc w:val="left"/>
+      <w:pPr>
+        <w:tabs>
+          <w:tab w:val="num" w:pos="2160"/>
+        </w:tabs>
+        <w:ind w:left="2160" w:hanging="360"/>
+      </w:pPr>
+    </w:lvl>
+    <w:lvl w:ilvl="3" w:tentative="1">
+      <w:start w:val="1"/>
+      <w:numFmt w:val="decimal"/>
+      <w:lvlText w:val="%4."/>
+      <w:lvlJc w:val="left"/>
+      <w:pPr>
+        <w:tabs>
+          <w:tab w:val="num" w:pos="2880"/>
+        </w:tabs>
+        <w:ind w:left="2880" w:hanging="360"/>
+      </w:pPr>
+    </w:lvl>
+    <w:lvl w:ilvl="4" w:tentative="1">
+      <w:start w:val="1"/>
+      <w:numFmt w:val="decimal"/>
+      <w:lvlText w:val="%5."/>
+      <w:lvlJc w:val="left"/>
+      <w:pPr>
+        <w:tabs>
+          <w:tab w:val="num" w:pos="3600"/>
+        </w:tabs>
+        <w:ind w:left="3600" w:hanging="360"/>
+      </w:pPr>
+    </w:lvl>
+    <w:lvl w:ilvl="5" w:tentative="1">
+      <w:start w:val="1"/>
+      <w:numFmt w:val="decimal"/>
+      <w:lvlText w:val="%6."/>
+      <w:lvlJc w:val="left"/>
+      <w:pPr>
+        <w:tabs>
+          <w:tab w:val="num" w:pos="4320"/>
+        </w:tabs>
+        <w:ind w:left="4320" w:hanging="360"/>
+      </w:pPr>
+    </w:lvl>
+    <w:lvl w:ilvl="6" w:tentative="1">
+      <w:start w:val="1"/>
+      <w:numFmt w:val="decimal"/>
+      <w:lvlText w:val="%7."/>
+      <w:lvlJc w:val="left"/>
+      <w:pPr>
+        <w:tabs>
+          <w:tab w:val="num" w:pos="5040"/>
+        </w:tabs>
+        <w:ind w:left="5040" w:hanging="360"/>
+      </w:pPr>
+    </w:lvl>
+    <w:lvl w:ilvl="7" w:tentative="1">
+      <w:start w:val="1"/>
+      <w:numFmt w:val="decimal"/>
+      <w:lvlText w:val="%8."/>
+      <w:lvlJc w:val="left"/>
+      <w:pPr>
+        <w:tabs>
+          <w:tab w:val="num" w:pos="5760"/>
+        </w:tabs>
+        <w:ind w:left="5760" w:hanging="360"/>
+      </w:pPr>
+    </w:lvl>
+    <w:lvl w:ilvl="8" w:tentative="1">
+      <w:start w:val="1"/>
+      <w:numFmt w:val="decimal"/>
+      <w:lvlText w:val="%9."/>
+      <w:lvlJc w:val="left"/>
+      <w:pPr>
+        <w:tabs>
+          <w:tab w:val="num" w:pos="6480"/>
+        </w:tabs>
+        <w:ind w:left="6480" w:hanging="360"/>
+      </w:pPr>
+    </w:lvl>
+  </w:abstractNum>
+  <w:abstractNum w:abstractNumId="4" w15:restartNumberingAfterBreak="0">
+    <w:nsid w:val="3E477233"/>
+    <w:multiLevelType w:val="multilevel"/>
+    <w:tmpl w:val="B624FABA"/>
+    <w:lvl w:ilvl="0">
+      <w:start w:val="1"/>
+      <w:numFmt w:val="bullet"/>
+      <w:lvlText w:val=""/>
+      <w:lvlJc w:val="left"/>
+      <w:pPr>
+        <w:tabs>
+          <w:tab w:val="num" w:pos="720"/>
+        </w:tabs>
+        <w:ind w:left="720" w:hanging="360"/>
+      </w:pPr>
+      <w:rPr>
+        <w:rFonts w:ascii="Symbol" w:hAnsi="Symbol" w:hint="default"/>
+        <w:sz w:val="20"/>
+      </w:rPr>
+    </w:lvl>
+    <w:lvl w:ilvl="1" w:tentative="1">
+      <w:start w:val="1"/>
+      <w:numFmt w:val="bullet"/>
+      <w:lvlText w:val="o"/>
+      <w:lvlJc w:val="left"/>
+      <w:pPr>
+        <w:tabs>
+          <w:tab w:val="num" w:pos="1440"/>
+        </w:tabs>
+        <w:ind w:left="1440" w:hanging="360"/>
+      </w:pPr>
+      <w:rPr>
+        <w:rFonts w:ascii="Courier New" w:hAnsi="Courier New" w:hint="default"/>
+        <w:sz w:val="20"/>
+      </w:rPr>
+    </w:lvl>
+    <w:lvl w:ilvl="2" w:tentative="1">
+      <w:start w:val="1"/>
+      <w:numFmt w:val="bullet"/>
+      <w:lvlText w:val=""/>
+      <w:lvlJc w:val="left"/>
+      <w:pPr>
+        <w:tabs>
+          <w:tab w:val="num" w:pos="2160"/>
+        </w:tabs>
+        <w:ind w:left="2160" w:hanging="360"/>
+      </w:pPr>
+      <w:rPr>
+        <w:rFonts w:ascii="Wingdings" w:hAnsi="Wingdings" w:hint="default"/>
+        <w:sz w:val="20"/>
+      </w:rPr>
+    </w:lvl>
+    <w:lvl w:ilvl="3" w:tentative="1">
+      <w:start w:val="1"/>
+      <w:numFmt w:val="bullet"/>
+      <w:lvlText w:val=""/>
+      <w:lvlJc w:val="left"/>
+      <w:pPr>
+        <w:tabs>
+          <w:tab w:val="num" w:pos="2880"/>
+        </w:tabs>
+        <w:ind w:left="2880" w:hanging="360"/>
+      </w:pPr>
+      <w:rPr>
+        <w:rFonts w:ascii="Wingdings" w:hAnsi="Wingdings" w:hint="default"/>
+        <w:sz w:val="20"/>
+      </w:rPr>
+    </w:lvl>
+    <w:lvl w:ilvl="4" w:tentative="1">
+      <w:start w:val="1"/>
+      <w:numFmt w:val="bullet"/>
+      <w:lvlText w:val=""/>
+      <w:lvlJc w:val="left"/>
+      <w:pPr>
+        <w:tabs>
+          <w:tab w:val="num" w:pos="3600"/>
+        </w:tabs>
+        <w:ind w:left="3600" w:hanging="360"/>
+      </w:pPr>
+      <w:rPr>
+        <w:rFonts w:ascii="Wingdings" w:hAnsi="Wingdings" w:hint="default"/>
+        <w:sz w:val="20"/>
+      </w:rPr>
+    </w:lvl>
+    <w:lvl w:ilvl="5" w:tentative="1">
+      <w:start w:val="1"/>
+      <w:numFmt w:val="bullet"/>
+      <w:lvlText w:val=""/>
+      <w:lvlJc w:val="left"/>
+      <w:pPr>
+        <w:tabs>
+          <w:tab w:val="num" w:pos="4320"/>
+        </w:tabs>
+        <w:ind w:left="4320" w:hanging="360"/>
+      </w:pPr>
+      <w:rPr>
+        <w:rFonts w:ascii="Wingdings" w:hAnsi="Wingdings" w:hint="default"/>
+        <w:sz w:val="20"/>
+      </w:rPr>
+    </w:lvl>
+    <w:lvl w:ilvl="6" w:tentative="1">
+      <w:start w:val="1"/>
+      <w:numFmt w:val="bullet"/>
+      <w:lvlText w:val=""/>
+      <w:lvlJc w:val="left"/>
+      <w:pPr>
+        <w:tabs>
+          <w:tab w:val="num" w:pos="5040"/>
+        </w:tabs>
+        <w:ind w:left="5040" w:hanging="360"/>
+      </w:pPr>
+      <w:rPr>
+        <w:rFonts w:ascii="Wingdings" w:hAnsi="Wingdings" w:hint="default"/>
+        <w:sz w:val="20"/>
+      </w:rPr>
+    </w:lvl>
+    <w:lvl w:ilvl="7" w:tentative="1">
+      <w:start w:val="1"/>
+      <w:numFmt w:val="bullet"/>
+      <w:lvlText w:val=""/>
+      <w:lvlJc w:val="left"/>
+      <w:pPr>
+        <w:tabs>
+          <w:tab w:val="num" w:pos="5760"/>
+        </w:tabs>
+        <w:ind w:left="5760" w:hanging="360"/>
+      </w:pPr>
+      <w:rPr>
+        <w:rFonts w:ascii="Wingdings" w:hAnsi="Wingdings" w:hint="default"/>
+        <w:sz w:val="20"/>
+      </w:rPr>
+    </w:lvl>
+    <w:lvl w:ilvl="8" w:tentative="1">
+      <w:start w:val="1"/>
+      <w:numFmt w:val="bullet"/>
+      <w:lvlText w:val=""/>
+      <w:lvlJc w:val="left"/>
+      <w:pPr>
+        <w:tabs>
+          <w:tab w:val="num" w:pos="6480"/>
+        </w:tabs>
+        <w:ind w:left="6480" w:hanging="360"/>
+      </w:pPr>
+      <w:rPr>
+        <w:rFonts w:ascii="Wingdings" w:hAnsi="Wingdings" w:hint="default"/>
+        <w:sz w:val="20"/>
+      </w:rPr>
+    </w:lvl>
+  </w:abstractNum>
+  <w:abstractNum w:abstractNumId="5" w15:restartNumberingAfterBreak="0">
+    <w:nsid w:val="59347B68"/>
+    <w:multiLevelType w:val="multilevel"/>
+    <w:tmpl w:val="4510D0F0"/>
+    <w:lvl w:ilvl="0">
+      <w:start w:val="1"/>
+      <w:numFmt w:val="bullet"/>
+      <w:lvlText w:val=""/>
+      <w:lvlJc w:val="left"/>
+      <w:pPr>
+        <w:tabs>
+          <w:tab w:val="num" w:pos="720"/>
+        </w:tabs>
+        <w:ind w:left="720" w:hanging="360"/>
+      </w:pPr>
+      <w:rPr>
+        <w:rFonts w:ascii="Symbol" w:hAnsi="Symbol" w:hint="default"/>
+        <w:sz w:val="20"/>
+      </w:rPr>
+    </w:lvl>
+    <w:lvl w:ilvl="1">
+      <w:start w:val="1"/>
+      <w:numFmt w:val="decimal"/>
+      <w:lvlText w:val="%2)"/>
+      <w:lvlJc w:val="left"/>
+      <w:pPr>
+        <w:ind w:left="1440" w:hanging="360"/>
+      </w:pPr>
+      <w:rPr>
+        <w:rFonts w:hint="default"/>
+        <w:b/>
+      </w:rPr>
+    </w:lvl>
+    <w:lvl w:ilvl="2" w:tentative="1">
+      <w:start w:val="1"/>
+      <w:numFmt w:val="bullet"/>
+      <w:lvlText w:val=""/>
+      <w:lvlJc w:val="left"/>
+      <w:pPr>
+        <w:tabs>
+          <w:tab w:val="num" w:pos="2160"/>
+        </w:tabs>
+        <w:ind w:left="2160" w:hanging="360"/>
+      </w:pPr>
+      <w:rPr>
+        <w:rFonts w:ascii="Wingdings" w:hAnsi="Wingdings" w:hint="default"/>
+        <w:sz w:val="20"/>
+      </w:rPr>
+    </w:lvl>
+    <w:lvl w:ilvl="3" w:tentative="1">
+      <w:start w:val="1"/>
+      <w:numFmt w:val="bullet"/>
+      <w:lvlText w:val=""/>
+      <w:lvlJc w:val="left"/>
+      <w:pPr>
+        <w:tabs>
+          <w:tab w:val="num" w:pos="2880"/>
+        </w:tabs>
+        <w:ind w:left="2880" w:hanging="360"/>
+      </w:pPr>
+      <w:rPr>
+        <w:rFonts w:ascii="Wingdings" w:hAnsi="Wingdings" w:hint="default"/>
+        <w:sz w:val="20"/>
+      </w:rPr>
+    </w:lvl>
+    <w:lvl w:ilvl="4" w:tentative="1">
+      <w:start w:val="1"/>
+      <w:numFmt w:val="bullet"/>
+      <w:lvlText w:val=""/>
+      <w:lvlJc w:val="left"/>
+      <w:pPr>
+        <w:tabs>
+          <w:tab w:val="num" w:pos="3600"/>
+        </w:tabs>
+        <w:ind w:left="3600" w:hanging="360"/>
+      </w:pPr>
+      <w:rPr>
+        <w:rFonts w:ascii="Wingdings" w:hAnsi="Wingdings" w:hint="default"/>
+        <w:sz w:val="20"/>
+      </w:rPr>
+    </w:lvl>
+    <w:lvl w:ilvl="5" w:tentative="1">
+      <w:start w:val="1"/>
+      <w:numFmt w:val="bullet"/>
+      <w:lvlText w:val=""/>
+      <w:lvlJc w:val="left"/>
+      <w:pPr>
+        <w:tabs>
+          <w:tab w:val="num" w:pos="4320"/>
+        </w:tabs>
+        <w:ind w:left="4320" w:hanging="360"/>
+      </w:pPr>
+      <w:rPr>
+        <w:rFonts w:ascii="Wingdings" w:hAnsi="Wingdings" w:hint="default"/>
+        <w:sz w:val="20"/>
+      </w:rPr>
+    </w:lvl>
+    <w:lvl w:ilvl="6" w:tentative="1">
+      <w:start w:val="1"/>
+      <w:numFmt w:val="bullet"/>
+      <w:lvlText w:val=""/>
+      <w:lvlJc w:val="left"/>
+      <w:pPr>
+        <w:tabs>
+          <w:tab w:val="num" w:pos="5040"/>
+        </w:tabs>
+        <w:ind w:left="5040" w:hanging="360"/>
+      </w:pPr>
+      <w:rPr>
+        <w:rFonts w:ascii="Wingdings" w:hAnsi="Wingdings" w:hint="default"/>
+        <w:sz w:val="20"/>
+      </w:rPr>
+    </w:lvl>
+    <w:lvl w:ilvl="7" w:tentative="1">
+      <w:start w:val="1"/>
+      <w:numFmt w:val="bullet"/>
+      <w:lvlText w:val=""/>
+      <w:lvlJc w:val="left"/>
+      <w:pPr>
+        <w:tabs>
+          <w:tab w:val="num" w:pos="5760"/>
+        </w:tabs>
+        <w:ind w:left="5760" w:hanging="360"/>
+      </w:pPr>
+      <w:rPr>
+        <w:rFonts w:ascii="Wingdings" w:hAnsi="Wingdings" w:hint="default"/>
+        <w:sz w:val="20"/>
+      </w:rPr>
+    </w:lvl>
+    <w:lvl w:ilvl="8" w:tentative="1">
+      <w:start w:val="1"/>
+      <w:numFmt w:val="bullet"/>
+      <w:lvlText w:val=""/>
+      <w:lvlJc w:val="left"/>
+      <w:pPr>
+        <w:tabs>
+          <w:tab w:val="num" w:pos="6480"/>
+        </w:tabs>
+        <w:ind w:left="6480" w:hanging="360"/>
+      </w:pPr>
+      <w:rPr>
+        <w:rFonts w:ascii="Wingdings" w:hAnsi="Wingdings" w:hint="default"/>
+        <w:sz w:val="20"/>
+      </w:rPr>
+    </w:lvl>
+  </w:abstractNum>
+  <w:abstractNum w:abstractNumId="6" w15:restartNumberingAfterBreak="0">
     <w:nsid w:val="75FD364E"/>
     <w:multiLevelType w:val="multilevel"/>
     <w:tmpl w:val="33661AFC"/>
@@ -1346,7 +2348,7 @@
       </w:rPr>
     </w:lvl>
   </w:abstractNum>
-  <w:abstractNum w:abstractNumId="3" w15:restartNumberingAfterBreak="0">
+  <w:abstractNum w:abstractNumId="7" w15:restartNumberingAfterBreak="0">
     <w:nsid w:val="7ADA60DE"/>
     <w:multiLevelType w:val="multilevel"/>
     <w:tmpl w:val="D5748524"/>
@@ -1460,16 +2462,28 @@
     </w:lvl>
   </w:abstractNum>
   <w:num w:numId="1" w16cid:durableId="1171723681">
+    <w:abstractNumId w:val="2"/>
+  </w:num>
+  <w:num w:numId="2" w16cid:durableId="237446722">
+    <w:abstractNumId w:val="7"/>
+  </w:num>
+  <w:num w:numId="3" w16cid:durableId="351764080">
     <w:abstractNumId w:val="1"/>
   </w:num>
-  <w:num w:numId="2" w16cid:durableId="237446722">
-    <w:abstractNumId w:val="3"/>
+  <w:num w:numId="4" w16cid:durableId="1085885839">
+    <w:abstractNumId w:val="6"/>
   </w:num>
-  <w:num w:numId="3" w16cid:durableId="351764080">
+  <w:num w:numId="5" w16cid:durableId="925454403">
     <w:abstractNumId w:val="0"/>
   </w:num>
-  <w:num w:numId="4" w16cid:durableId="1085885839">
-    <w:abstractNumId w:val="2"/>
+  <w:num w:numId="6" w16cid:durableId="1077247536">
+    <w:abstractNumId w:val="5"/>
+  </w:num>
+  <w:num w:numId="7" w16cid:durableId="698968600">
+    <w:abstractNumId w:val="4"/>
+  </w:num>
+  <w:num w:numId="8" w16cid:durableId="739792962">
+    <w:abstractNumId w:val="3"/>
   </w:num>
 </w:numbering>
 </file>

</xml_diff>